<commit_message>
Live closed-loop control test: MPC -30% J/token vs always-on, 0% SLO misses (real vLLM, A5000)
Job 85109: Qwen2.5-3B on one 100-W-capped A5000, bursty arrivals, virtual budget
100->88->78->100 W, 30 s TTFT SLO, 4 controllers x 3 reps on paired traces. MPC -30%+-3
J/token, TTFT p50 10 s / p99 27 s, 0% SLO misses, 6% windows over budget, 23-31 ms/decision.
PI -7% (60% SLO misses, 26% over budget); POLCA-style +6% (77%, 40%); always-on 40% over
budget. Sim predicted the ranking and ~-18%. Lever = batch-synchronous gating under the cap
(latency-tolerant serving only). Brief (new Figure 9, docx rebuilt, 9 images) + proposal updated.

Co-Authored-By: Claude Opus 5.5 (1M context) <noreply@anthropic.com>
</commit_message>
<xml_diff>
--- a/GPU_power/PI_BRIEF.docx
+++ b/GPU_power/PI_BRIEF.docx
@@ -139,7 +139,7 @@
         <w:rPr>
           <w:i w:val="0"/>
         </w:rPr>
-        <w:t xml:space="preserve"> the model tells which GPU is cheaper for each serving phase (decode on H200 is a confident result; prefill on B200 is probable). In simulation, a model-based fleet power controller uses 12–22% less energy than the best feedback baseline.</w:t>
+        <w:t xml:space="preserve"> the model tells which GPU is cheaper for each serving phase (decode on H200 is a confident result; prefill on B200 is probable). In simulation, a model-based fleet power controller uses 12–22% less energy than the best feedback baseline; in a live test on a real vLLM server it used 30% less energy per token than serving requests immediately while meeting a 30 s latency SLO.</w:t>
       </w:r>
     </w:p>
     <w:p>
@@ -2111,7 +2111,7 @@
         <w:pStyle w:val="Heading1"/>
       </w:pPr>
       <w:r>
-        <w:t>7. Application: fleet power control (simulation)</w:t>
+        <w:t>7. Application: fleet power control (simulation + one live test)</w:t>
       </w:r>
     </w:p>
     <w:p>
@@ -2345,13 +2345,160 @@
           <w:b/>
           <w:i w:val="0"/>
         </w:rPr>
-        <w:t>Not yet run:</w:t>
+        <w:t>Live test on a real server.</w:t>
       </w:r>
       <w:r>
         <w:rPr>
           <w:i w:val="0"/>
         </w:rPr>
-        <w:t xml:space="preserve"> a live closed-loop test on one A5000 is built and dry-run. The CPU simulation predicts about 20% lower J/token from batch-synchronous gating at a 30 s TTFT SLO.</w:t>
+        <w:t xml:space="preserve"> We ran the controllers in the loop on a real vLLM server: one RTX A5000, Qwen2.5-3B, bursty arrivals, a virtual power budget stepping 100 → 88 → 78 → 100 W, and a 30 s time-to-first-token (TTFT) SLO. Four controllers × 3 reps, each rep replaying the same arrival trace for every controller.</w:t>
+      </w:r>
+    </w:p>
+    <w:p>
+      <w:pPr>
+        <w:jc w:val="center"/>
+      </w:pPr>
+      <w:r>
+        <w:drawing>
+          <wp:inline xmlns:a="http://schemas.openxmlformats.org/drawingml/2006/main" xmlns:pic="http://schemas.openxmlformats.org/drawingml/2006/picture">
+            <wp:extent cx="5760720" cy="1824228"/>
+            <wp:docPr id="9" name="Picture 9"/>
+            <wp:cNvGraphicFramePr>
+              <a:graphicFrameLocks noChangeAspect="1"/>
+            </wp:cNvGraphicFramePr>
+            <a:graphic>
+              <a:graphicData uri="http://schemas.openxmlformats.org/drawingml/2006/picture">
+                <pic:pic>
+                  <pic:nvPicPr>
+                    <pic:cNvPr id="0" name="fig_live_control.png"/>
+                    <pic:cNvPicPr/>
+                  </pic:nvPicPr>
+                  <pic:blipFill>
+                    <a:blip r:embed="rId17"/>
+                    <a:stretch>
+                      <a:fillRect/>
+                    </a:stretch>
+                  </pic:blipFill>
+                  <pic:spPr>
+                    <a:xfrm>
+                      <a:off x="0" y="0"/>
+                      <a:ext cx="5760720" cy="1824228"/>
+                    </a:xfrm>
+                    <a:prstGeom prst="rect"/>
+                  </pic:spPr>
+                </pic:pic>
+              </a:graphicData>
+            </a:graphic>
+          </wp:inline>
+        </w:drawing>
+      </w:r>
+    </w:p>
+    <w:p>
+      <w:r>
+        <w:rPr>
+          <w:i/>
+          <w:color w:val="444444"/>
+          <w:sz w:val="19"/>
+        </w:rPr>
+        <w:t>Figure 9. On a real server, MPC used 30% less energy per token than serving requests immediately, and it was the only controller that met the latency SLO and nearly held the power budget.</w:t>
+      </w:r>
+    </w:p>
+    <w:p>
+      <w:pPr>
+        <w:pStyle w:val="ListBullet"/>
+      </w:pPr>
+      <w:r>
+        <w:rPr>
+          <w:b/>
+          <w:i w:val="0"/>
+        </w:rPr>
+        <w:t>MPC:</w:t>
+      </w:r>
+      <w:r>
+        <w:rPr>
+          <w:i w:val="0"/>
+        </w:rPr>
+        <w:t xml:space="preserve"> −30% ± 3 J/token vs always-on; TTFT median 10 s, p99 27 s (0% SLO violations); over budget in 6% of 20 s windows; 23–31 ms per decision.</w:t>
+      </w:r>
+    </w:p>
+    <w:p>
+      <w:pPr>
+        <w:pStyle w:val="ListBullet"/>
+      </w:pPr>
+      <w:r>
+        <w:rPr>
+          <w:b/>
+          <w:i w:val="0"/>
+        </w:rPr>
+        <w:t>PI:</w:t>
+      </w:r>
+      <w:r>
+        <w:rPr>
+          <w:i w:val="0"/>
+        </w:rPr>
+        <w:t xml:space="preserve"> −7% energy, but it missed the SLO 60% of the time and the budget 26%. </w:t>
+      </w:r>
+      <w:r>
+        <w:rPr>
+          <w:b/>
+          <w:i w:val="0"/>
+        </w:rPr>
+        <w:t>POLCA-style:</w:t>
+      </w:r>
+      <w:r>
+        <w:rPr>
+          <w:i w:val="0"/>
+        </w:rPr>
+        <w:t xml:space="preserve"> +6% energy, 77% SLO misses, 40% over budget. </w:t>
+      </w:r>
+      <w:r>
+        <w:rPr>
+          <w:b/>
+          <w:i w:val="0"/>
+        </w:rPr>
+        <w:t>Always-on:</w:t>
+      </w:r>
+      <w:r>
+        <w:rPr>
+          <w:i w:val="0"/>
+        </w:rPr>
+        <w:t xml:space="preserve"> meets latency trivially (0.05 s) but exceeds the budget 40% of the time.</w:t>
+      </w:r>
+    </w:p>
+    <w:p>
+      <w:pPr>
+        <w:pStyle w:val="ListBullet"/>
+      </w:pPr>
+      <w:r>
+        <w:rPr>
+          <w:b/>
+          <w:i w:val="0"/>
+        </w:rPr>
+        <w:t>The simulation got the ranking right</w:t>
+      </w:r>
+      <w:r>
+        <w:rPr>
+          <w:i w:val="0"/>
+        </w:rPr>
+        <w:t xml:space="preserve"> and predicted about −18% for MPC; the live saving was larger.</w:t>
+      </w:r>
+    </w:p>
+    <w:p>
+      <w:pPr>
+        <w:pStyle w:val="ListBullet"/>
+      </w:pPr>
+      <w:r>
+        <w:rPr>
+          <w:b/>
+          <w:i w:val="0"/>
+        </w:rPr>
+        <w:t>Caveats.</w:t>
+      </w:r>
+      <w:r>
+        <w:rPr>
+          <w:i w:val="0"/>
+        </w:rPr>
+        <w:t xml:space="preserve"> This A5000 is capped at 100 W, so power is nearly flat whenever it runs. The only lever is holding requests and releasing them in batches, which trades latency (median 10 s) for energy. That suits batch or offline serving with a 30 s SLO, not interactive chat. The budget is virtual (enforced through admission), not a hardware power cap. The heterogeneous-fleet power-capping result above remains simulation-only.</w:t>
       </w:r>
     </w:p>
     <w:p>
@@ -2662,7 +2809,7 @@
               <w:rPr>
                 <w:i w:val="0"/>
               </w:rPr>
-              <w:t>MPC saves 12–22% vs best feedback</w:t>
+              <w:t>MPC saves 12–22% vs best feedback on H200+B200 fleets</w:t>
             </w:r>
           </w:p>
         </w:tc>
@@ -2677,6 +2824,36 @@
                 <w:i w:val="0"/>
               </w:rPr>
               <w:t>Simulation only</w:t>
+            </w:r>
+          </w:p>
+        </w:tc>
+      </w:tr>
+      <w:tr>
+        <w:tc>
+          <w:tcPr>
+            <w:tcW w:type="dxa" w:w="4320"/>
+          </w:tcPr>
+          <w:p>
+            <w:r/>
+            <w:r>
+              <w:rPr>
+                <w:i w:val="0"/>
+              </w:rPr>
+              <w:t>MPC in the loop on a real server: −30% J/token, 0% SLO misses</w:t>
+            </w:r>
+          </w:p>
+        </w:tc>
+        <w:tc>
+          <w:tcPr>
+            <w:tcW w:type="dxa" w:w="4320"/>
+          </w:tcPr>
+          <w:p>
+            <w:r/>
+            <w:r>
+              <w:rPr>
+                <w:i w:val="0"/>
+              </w:rPr>
+              <w:t>Established for one capped A5000, latency-tolerant workload</w:t>
             </w:r>
           </w:p>
         </w:tc>
@@ -2777,13 +2954,13 @@
           <w:b/>
           <w:i w:val="0"/>
         </w:rPr>
-        <w:t>Run the live closed-loop control test on an A5000.</w:t>
+        <w:t>Extend the live control test</w:t>
       </w:r>
       <w:r>
         <w:rPr>
           <w:i w:val="0"/>
         </w:rPr>
-        <w:t xml:space="preserve"> It is built; it needs one GPU-hour.</w:t>
+        <w:t xml:space="preserve"> to an interactive (sub-second TTFT) SLO and to an uncapped GPU, where the lever is power capping rather than batching.</w:t>
       </w:r>
     </w:p>
     <w:p>

</xml_diff>

<commit_message>
Adopt B200 NCU validation (DRAM/analytic = 1.004); review note on the DRAM-channel law claim
Hardware counters validate the analytic byte model to 0.4% under the canonical models.py
convention, and show every DRAM byte crosses L2 ~1.9x / TMA ~1.2x (per-byte energy =
DRAM + on-chip hierarchy). Review note: '1/BW law holds for DRAM (+3%)' compares B200
DRAM-only vs H200 LUMPED scaled; the law would need H200 DRAM-only = 1.107e-10 > its
total 1.07e-10 -> unestablished, bound argument disfavors it. Brief (evidence table,
next steps, docx) and proposal risks updated.

Co-Authored-By: Claude Opus 5.5 (1M context) <noreply@anthropic.com>
</commit_message>
<xml_diff>
--- a/GPU_power/PI_BRIEF.docx
+++ b/GPU_power/PI_BRIEF.docx
@@ -1042,6 +1042,46 @@
           <w:i w:val="0"/>
         </w:rPr>
         <w:t xml:space="preserve"> why B200 costs 16% more per byte than H200 on the same memory technology.</w:t>
+      </w:r>
+    </w:p>
+    <w:p>
+      <w:r>
+        <w:rPr>
+          <w:b/>
+          <w:i w:val="0"/>
+        </w:rPr>
+        <w:t>New: hardware counters validate the byte model (B200, ncu).</w:t>
+      </w:r>
+      <w:r>
+        <w:rPr>
+          <w:i w:val="0"/>
+        </w:rPr>
+        <w:t xml:space="preserve"> On a batch-1 Qwen2-7B decode, measured DRAM traffic was 14.20 GB per forward pass against our analytic 14.14 GB, a ratio of </w:t>
+      </w:r>
+      <w:r>
+        <w:rPr>
+          <w:b/>
+          <w:i w:val="0"/>
+        </w:rPr>
+        <w:t>1.004</w:t>
+      </w:r>
+      <w:r>
+        <w:rPr>
+          <w:i w:val="0"/>
+        </w:rPr>
+        <w:t xml:space="preserve">. The denominator under every coefficient is correct to 0.4%, and this independently confirms our byte-counting convention (the rejected convention gives 0.932). The counters also show every DRAM byte crosses L2 about 1.9× and the TMA path about 1.2×. So our per-byte coefficient is DRAM energy plus on-chip hierarchy energy; using a colleague's per-channel energies, DRAM is only about half of B200's per-byte cost. Whether the 1/BW law holds for the DRAM channel </w:t>
+      </w:r>
+      <w:r>
+        <w:rPr>
+          <w:i/>
+        </w:rPr>
+        <w:t>alone</w:t>
+      </w:r>
+      <w:r>
+        <w:rPr>
+          <w:i w:val="0"/>
+        </w:rPr>
+        <w:t xml:space="preserve"> is unestablished: a bound argument disfavors it (it would require H200 to spend almost nothing on-chip), and the same measurement on H200 would settle it, but H200 access is gone.</w:t>
       </w:r>
     </w:p>
     <w:p>
@@ -2652,6 +2692,79 @@
               <w:rPr>
                 <w:i w:val="0"/>
               </w:rPr>
+              <w:t>Analytic byte counts match hardware DRAM counters (1.004)</w:t>
+            </w:r>
+          </w:p>
+        </w:tc>
+        <w:tc>
+          <w:tcPr>
+            <w:tcW w:type="dxa" w:w="4320"/>
+          </w:tcPr>
+          <w:p>
+            <w:r/>
+            <w:r>
+              <w:rPr>
+                <w:i w:val="0"/>
+              </w:rPr>
+              <w:t xml:space="preserve">Established (B200, </w:t>
+            </w:r>
+            <w:r>
+              <w:rPr>
+                <w:rFonts w:ascii="Consolas" w:hAnsi="Consolas"/>
+                <w:i w:val="0"/>
+              </w:rPr>
+              <w:t>ncu</w:t>
+            </w:r>
+            <w:r>
+              <w:rPr>
+                <w:i w:val="0"/>
+              </w:rPr>
+              <w:t>, batch-1 decode)</w:t>
+            </w:r>
+          </w:p>
+        </w:tc>
+      </w:tr>
+      <w:tr>
+        <w:tc>
+          <w:tcPr>
+            <w:tcW w:type="dxa" w:w="4320"/>
+          </w:tcPr>
+          <w:p>
+            <w:r/>
+            <w:r>
+              <w:rPr>
+                <w:i w:val="0"/>
+              </w:rPr>
+              <w:t>1/BW law holds for the DRAM channel alone</w:t>
+            </w:r>
+          </w:p>
+        </w:tc>
+        <w:tc>
+          <w:tcPr>
+            <w:tcW w:type="dxa" w:w="4320"/>
+          </w:tcPr>
+          <w:p>
+            <w:r/>
+            <w:r>
+              <w:rPr>
+                <w:i w:val="0"/>
+              </w:rPr>
+              <w:t>Unestablished (borrowed per-channel energies; bound argument disfavors it)</w:t>
+            </w:r>
+          </w:p>
+        </w:tc>
+      </w:tr>
+      <w:tr>
+        <w:tc>
+          <w:tcPr>
+            <w:tcW w:type="dxa" w:w="4320"/>
+          </w:tcPr>
+          <w:p>
+            <w:r/>
+            <w:r>
+              <w:rPr>
+                <w:i w:val="0"/>
+              </w:rPr>
               <w:t>Recommender within ~4% J/token on measured GPUs</w:t>
             </w:r>
           </w:p>
@@ -2905,26 +3018,13 @@
           <w:b/>
           <w:i w:val="0"/>
         </w:rPr>
-        <w:t>Validate byte counts on hardware with ncu on B200.</w:t>
+        <w:t>Split the per-byte coefficient into DRAM and on-chip channels.</w:t>
       </w:r>
       <w:r>
         <w:rPr>
           <w:i w:val="0"/>
         </w:rPr>
-        <w:t xml:space="preserve"> Our byte counts are analytic and have never been checked against hardware counters. Counters are blocked on the A5000 node (</w:t>
-      </w:r>
-      <w:r>
-        <w:rPr>
-          <w:rFonts w:ascii="Consolas" w:hAnsi="Consolas"/>
-          <w:i w:val="0"/>
-        </w:rPr>
-        <w:t>ERR_NVGPUCTRPERM</w:t>
-      </w:r>
-      <w:r>
-        <w:rPr>
-          <w:i w:val="0"/>
-        </w:rPr>
-        <w:t>).</w:t>
+        <w:t xml:space="preserve"> Hardware counters now validate the byte counts (done on B200) and give the per-channel traffic; the next step is per-channel energies measured on our own GPUs rather than borrowed.</w:t>
       </w:r>
     </w:p>
     <w:p>

</xml_diff>